<commit_message>
po boq po report
</commit_message>
<xml_diff>
--- a/APLOS/POPResources/Templates/PurchaseOrder202034.docx
+++ b/APLOS/POPResources/Templates/PurchaseOrder202034.docx
@@ -1,6 +1,6 @@
 
 <file path=word/document.xml><?xml version="1.0" encoding="utf-8"?>
-<w:document xmlns:wpc="http://schemas.microsoft.com/office/word/2010/wordprocessingCanvas" xmlns:cx="http://schemas.microsoft.com/office/drawing/2014/chartex" xmlns:cx1="http://schemas.microsoft.com/office/drawing/2015/9/8/chartex" xmlns:cx2="http://schemas.microsoft.com/office/drawing/2015/10/21/chartex" xmlns:cx3="http://schemas.microsoft.com/office/drawing/2016/5/9/chartex" xmlns:cx4="http://schemas.microsoft.com/office/drawing/2016/5/10/chartex" xmlns:cx5="http://schemas.microsoft.com/office/drawing/2016/5/11/chartex" xmlns:cx6="http://schemas.microsoft.com/office/drawing/2016/5/12/chartex" xmlns:cx7="http://schemas.microsoft.com/office/drawing/2016/5/13/chartex" xmlns:cx8="http://schemas.microsoft.com/office/drawing/2016/5/14/chartex" xmlns:mc="http://schemas.openxmlformats.org/markup-compatibility/2006" xmlns:aink="http://schemas.microsoft.com/office/drawing/2016/ink" xmlns:am3d="http://schemas.microsoft.com/office/drawing/2017/model3d" xmlns:o="urn:schemas-microsoft-com:office:office" xmlns:oel="http://schemas.microsoft.com/office/2019/extlst" xmlns:r="http://schemas.openxmlformats.org/officeDocument/2006/relationships" xmlns:m="http://schemas.openxmlformats.org/officeDocument/2006/math" xmlns:v="urn:schemas-microsoft-com:vml" xmlns:wp14="http://schemas.microsoft.com/office/word/2010/wordprocessingDrawing" xmlns:wp="http://schemas.openxmlformats.org/drawingml/2006/wordprocessingDrawing" xmlns:w10="urn:schemas-microsoft-com:office:word" xmlns:w="http://schemas.openxmlformats.org/wordprocessingml/2006/main" xmlns:w14="http://schemas.microsoft.com/office/word/2010/wordml" xmlns:w15="http://schemas.microsoft.com/office/word/2012/wordml" xmlns:w16cex="http://schemas.microsoft.com/office/word/2018/wordml/cex" xmlns:w16cid="http://schemas.microsoft.com/office/word/2016/wordml/cid" xmlns:w16="http://schemas.microsoft.com/office/word/2018/wordml" xmlns:w16sdtdh="http://schemas.microsoft.com/office/word/2020/wordml/sdtdatahash" xmlns:w16se="http://schemas.microsoft.com/office/word/2015/wordml/symex" xmlns:wpg="http://schemas.microsoft.com/office/word/2010/wordprocessingGroup" xmlns:wpi="http://schemas.microsoft.com/office/word/2010/wordprocessingInk" xmlns:wne="http://schemas.microsoft.com/office/word/2006/wordml" xmlns:wps="http://schemas.microsoft.com/office/word/2010/wordprocessingShape" mc:Ignorable="w14 w15 w16se w16cid w16 w16cex w16sdtdh wp14">
+<w:document xmlns:wpc="http://schemas.microsoft.com/office/word/2010/wordprocessingCanvas" xmlns:cx="http://schemas.microsoft.com/office/drawing/2014/chartex" xmlns:cx1="http://schemas.microsoft.com/office/drawing/2015/9/8/chartex" xmlns:cx2="http://schemas.microsoft.com/office/drawing/2015/10/21/chartex" xmlns:cx3="http://schemas.microsoft.com/office/drawing/2016/5/9/chartex" xmlns:cx4="http://schemas.microsoft.com/office/drawing/2016/5/10/chartex" xmlns:cx5="http://schemas.microsoft.com/office/drawing/2016/5/11/chartex" xmlns:cx6="http://schemas.microsoft.com/office/drawing/2016/5/12/chartex" xmlns:cx7="http://schemas.microsoft.com/office/drawing/2016/5/13/chartex" xmlns:cx8="http://schemas.microsoft.com/office/drawing/2016/5/14/chartex" xmlns:mc="http://schemas.openxmlformats.org/markup-compatibility/2006" xmlns:aink="http://schemas.microsoft.com/office/drawing/2016/ink" xmlns:am3d="http://schemas.microsoft.com/office/drawing/2017/model3d" xmlns:o="urn:schemas-microsoft-com:office:office" xmlns:oel="http://schemas.microsoft.com/office/2019/extlst" xmlns:r="http://schemas.openxmlformats.org/officeDocument/2006/relationships" xmlns:m="http://schemas.openxmlformats.org/officeDocument/2006/math" xmlns:v="urn:schemas-microsoft-com:vml" xmlns:wp14="http://schemas.microsoft.com/office/word/2010/wordprocessingDrawing" xmlns:wp="http://schemas.openxmlformats.org/drawingml/2006/wordprocessingDrawing" xmlns:w10="urn:schemas-microsoft-com:office:word" xmlns:w="http://schemas.openxmlformats.org/wordprocessingml/2006/main" xmlns:w14="http://schemas.microsoft.com/office/word/2010/wordml" xmlns:w15="http://schemas.microsoft.com/office/word/2012/wordml" xmlns:w16cex="http://schemas.microsoft.com/office/word/2018/wordml/cex" xmlns:w16cid="http://schemas.microsoft.com/office/word/2016/wordml/cid" xmlns:w16="http://schemas.microsoft.com/office/word/2018/wordml" xmlns:w16du="http://schemas.microsoft.com/office/word/2023/wordml/word16du" xmlns:w16sdtdh="http://schemas.microsoft.com/office/word/2020/wordml/sdtdatahash" xmlns:w16se="http://schemas.microsoft.com/office/word/2015/wordml/symex" xmlns:wpg="http://schemas.microsoft.com/office/word/2010/wordprocessingGroup" xmlns:wpi="http://schemas.microsoft.com/office/word/2010/wordprocessingInk" xmlns:wne="http://schemas.microsoft.com/office/word/2006/wordml" xmlns:wps="http://schemas.microsoft.com/office/word/2010/wordprocessingShape" mc:Ignorable="w14 w15 w16se w16cid w16 w16cex w16sdtdh wp14">
   <w:body>
     <w:p>
       <w:pPr>
@@ -560,9 +560,8 @@
                 <w:sz w:val="16"/>
                 <w:szCs w:val="16"/>
               </w:rPr>
-              <w:t>Payment Term Days</w:t>
-            </w:r>
-            <w:proofErr w:type="gramStart"/>
+              <w:t xml:space="preserve">Payment Term Days: </w:t>
+            </w:r>
             <w:r>
               <w:rPr>
                 <w:rFonts w:ascii="Tahoma" w:hAnsi="Tahoma" w:cs="Tahoma"/>
@@ -570,27 +569,17 @@
                 <w:sz w:val="16"/>
                 <w:szCs w:val="16"/>
               </w:rPr>
-              <w:t xml:space="preserve">: </w:t>
+              <w:t xml:space="preserve"> </w:t>
             </w:r>
             <w:r>
               <w:rPr>
                 <w:rFonts w:ascii="Tahoma" w:hAnsi="Tahoma" w:cs="Tahoma"/>
-                <w:b/>
-                <w:sz w:val="16"/>
-                <w:szCs w:val="16"/>
-              </w:rPr>
-              <w:t xml:space="preserve"> </w:t>
-            </w:r>
-            <w:r>
-              <w:rPr>
-                <w:rFonts w:ascii="Tahoma" w:hAnsi="Tahoma" w:cs="Tahoma"/>
                 <w:sz w:val="16"/>
                 <w:szCs w:val="16"/>
               </w:rPr>
               <w:t>{</w:t>
             </w:r>
             <w:proofErr w:type="spellStart"/>
-            <w:proofErr w:type="gramEnd"/>
             <w:r>
               <w:rPr>
                 <w:rFonts w:ascii="Consolas" w:hAnsi="Consolas" w:cs="Consolas"/>
@@ -614,7 +603,7 @@
       </w:tr>
       <w:tr>
         <w:trPr>
-          <w:trHeight w:val="440"/>
+          <w:trHeight w:val="887"/>
         </w:trPr>
         <w:tc>
           <w:tcPr>
@@ -622,6 +611,7 @@
           </w:tcPr>
           <w:p>
             <w:pPr>
+              <w:spacing w:line="288" w:lineRule="auto"/>
               <w:rPr>
                 <w:rFonts w:ascii="Tahoma" w:hAnsi="Tahoma" w:cs="Tahoma"/>
                 <w:sz w:val="16"/>
@@ -675,6 +665,7 @@
           </w:p>
           <w:p>
             <w:pPr>
+              <w:spacing w:line="288" w:lineRule="auto"/>
               <w:rPr>
                 <w:rFonts w:ascii="Tahoma" w:eastAsia="Times New Roman" w:hAnsi="Tahoma" w:cs="Tahoma"/>
                 <w:color w:val="000000"/>
@@ -712,6 +703,73 @@
               <w:t>DeliveryByAddress</w:t>
             </w:r>
             <w:proofErr w:type="spellEnd"/>
+            <w:r>
+              <w:rPr>
+                <w:rFonts w:ascii="Tahoma" w:eastAsia="Times New Roman" w:hAnsi="Tahoma" w:cs="Tahoma"/>
+                <w:color w:val="000000"/>
+                <w:sz w:val="16"/>
+                <w:szCs w:val="16"/>
+              </w:rPr>
+              <w:t>}</w:t>
+            </w:r>
+          </w:p>
+          <w:p>
+            <w:pPr>
+              <w:spacing w:line="288" w:lineRule="auto"/>
+              <w:rPr>
+                <w:rFonts w:ascii="Tahoma" w:eastAsia="Times New Roman" w:hAnsi="Tahoma" w:cs="Tahoma"/>
+                <w:color w:val="000000"/>
+                <w:sz w:val="16"/>
+                <w:szCs w:val="16"/>
+              </w:rPr>
+            </w:pPr>
+            <w:r>
+              <w:rPr>
+                <w:rFonts w:ascii="Tahoma" w:eastAsia="Arial" w:hAnsi="Tahoma" w:cs="Tahoma"/>
+                <w:b/>
+                <w:bCs/>
+                <w:sz w:val="16"/>
+                <w:szCs w:val="16"/>
+              </w:rPr>
+              <w:t>GSTIN</w:t>
+            </w:r>
+            <w:r>
+              <w:rPr>
+                <w:rFonts w:ascii="Tahoma" w:eastAsia="Times New Roman" w:hAnsi="Tahoma" w:cs="Tahoma"/>
+                <w:color w:val="000000"/>
+                <w:sz w:val="16"/>
+                <w:szCs w:val="16"/>
+              </w:rPr>
+              <w:t xml:space="preserve"> </w:t>
+            </w:r>
+            <w:r>
+              <w:rPr>
+                <w:rFonts w:ascii="Tahoma" w:eastAsia="Arial" w:hAnsi="Tahoma" w:cs="Tahoma"/>
+                <w:b/>
+                <w:bCs/>
+                <w:sz w:val="16"/>
+                <w:szCs w:val="16"/>
+              </w:rPr>
+              <w:t>No</w:t>
+            </w:r>
+            <w:r>
+              <w:rPr>
+                <w:rFonts w:ascii="Tahoma" w:eastAsia="Times New Roman" w:hAnsi="Tahoma" w:cs="Tahoma"/>
+                <w:color w:val="000000"/>
+                <w:sz w:val="16"/>
+                <w:szCs w:val="16"/>
+              </w:rPr>
+              <w:t>: {</w:t>
+            </w:r>
+            <w:r>
+              <w:rPr>
+                <w:rFonts w:ascii="Consolas" w:hAnsi="Consolas" w:cs="Consolas"/>
+                <w:color w:val="000000"/>
+                <w:sz w:val="19"/>
+                <w:szCs w:val="19"/>
+              </w:rPr>
+              <w:t>GSTIN</w:t>
+            </w:r>
             <w:r>
               <w:rPr>
                 <w:rFonts w:ascii="Tahoma" w:eastAsia="Times New Roman" w:hAnsi="Tahoma" w:cs="Tahoma"/>
@@ -730,6 +788,7 @@
           </w:tcPr>
           <w:p>
             <w:pPr>
+              <w:spacing w:line="288" w:lineRule="auto"/>
               <w:rPr>
                 <w:rFonts w:ascii="Tahoma" w:hAnsi="Tahoma" w:cs="Tahoma"/>
                 <w:sz w:val="16"/>
@@ -783,6 +842,7 @@
           </w:p>
           <w:p>
             <w:pPr>
+              <w:spacing w:line="288" w:lineRule="auto"/>
               <w:rPr>
                 <w:rFonts w:ascii="Tahoma" w:eastAsia="Times New Roman" w:hAnsi="Tahoma" w:cs="Tahoma"/>
                 <w:color w:val="000000"/>
@@ -841,18 +901,58 @@
           </w:p>
           <w:p>
             <w:pPr>
+              <w:spacing w:line="288" w:lineRule="auto"/>
               <w:rPr>
                 <w:rFonts w:ascii="Tahoma" w:hAnsi="Tahoma" w:cs="Tahoma"/>
                 <w:sz w:val="16"/>
                 <w:szCs w:val="16"/>
               </w:rPr>
             </w:pPr>
+            <w:r>
+              <w:rPr>
+                <w:rFonts w:ascii="Tahoma" w:eastAsia="Arial" w:hAnsi="Tahoma" w:cs="Tahoma"/>
+                <w:b/>
+                <w:bCs/>
+                <w:sz w:val="16"/>
+                <w:szCs w:val="16"/>
+              </w:rPr>
+              <w:t>GSTIN No</w:t>
+            </w:r>
+            <w:r>
+              <w:rPr>
+                <w:rFonts w:ascii="Tahoma" w:eastAsia="Times New Roman" w:hAnsi="Tahoma" w:cs="Tahoma"/>
+                <w:color w:val="000000"/>
+                <w:sz w:val="16"/>
+                <w:szCs w:val="16"/>
+              </w:rPr>
+              <w:t>: {</w:t>
+            </w:r>
+            <w:proofErr w:type="spellStart"/>
+            <w:r>
+              <w:rPr>
+                <w:rFonts w:ascii="Consolas" w:hAnsi="Consolas" w:cs="Consolas"/>
+                <w:color w:val="000000"/>
+                <w:sz w:val="19"/>
+                <w:szCs w:val="19"/>
+              </w:rPr>
+              <w:t>InvoicingPartyGSTIN</w:t>
+            </w:r>
+            <w:proofErr w:type="spellEnd"/>
+            <w:r>
+              <w:rPr>
+                <w:rFonts w:ascii="Tahoma" w:eastAsia="Times New Roman" w:hAnsi="Tahoma" w:cs="Tahoma"/>
+                <w:color w:val="000000"/>
+                <w:sz w:val="16"/>
+                <w:szCs w:val="16"/>
+              </w:rPr>
+              <w:t>}</w:t>
+            </w:r>
           </w:p>
         </w:tc>
       </w:tr>
       <w:tr>
         <w:trPr>
-          <w:trHeight w:val="154"/>
+          <w:trHeight w:val="347"/>
         </w:trPr>
         <w:tc>
           <w:tcPr>
@@ -982,7 +1082,7 @@
           <w:tblLook w:val="0000" w:firstRow="0" w:lastRow="0" w:firstColumn="0" w:lastColumn="0" w:noHBand="0" w:noVBand="0"/>
         </w:tblPrEx>
         <w:trPr>
-          <w:trHeight w:val="372"/>
+          <w:trHeight w:val="608"/>
         </w:trPr>
         <w:tc>
           <w:tcPr>
@@ -1873,7 +1973,7 @@
                       </mc:Choice>
                       <mc:Fallback>
                         <w:pict>
-                          <v:line w14:anchorId="6A996DAF" id="Straight Connector 3" o:spid="_x0000_s1026" style="position:absolute;flip:x;z-index:251688960;visibility:visible;mso-wrap-style:square;mso-width-percent:0;mso-height-percent:0;mso-wrap-distance-left:9pt;mso-wrap-distance-top:0;mso-wrap-distance-right:9pt;mso-wrap-distance-bottom:0;mso-position-horizontal:absolute;mso-position-horizontal-relative:text;mso-position-vertical:absolute;mso-position-vertical-relative:text;mso-width-percent:0;mso-height-percent:0;mso-width-relative:margin;mso-height-relative:margin" from="30.2pt,8.35pt" to="139.75pt,8.35pt" o:gfxdata="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" strokecolor="windowText" strokeweight=".5pt">
+                          <v:line w14:anchorId="490807BA" id="Straight Connector 3" o:spid="_x0000_s1026" style="position:absolute;flip:x;z-index:251688960;visibility:visible;mso-wrap-style:square;mso-width-percent:0;mso-height-percent:0;mso-wrap-distance-left:9pt;mso-wrap-distance-top:0;mso-wrap-distance-right:9pt;mso-wrap-distance-bottom:0;mso-position-horizontal:absolute;mso-position-horizontal-relative:text;mso-position-vertical:absolute;mso-position-vertical-relative:text;mso-width-percent:0;mso-height-percent:0;mso-width-relative:margin;mso-height-relative:margin" from="30.2pt,8.35pt" to="139.75pt,8.35pt" o:gfxdata="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" strokecolor="windowText" strokeweight=".5pt">
                             <v:stroke joinstyle="miter"/>
                           </v:line>
                         </w:pict>
@@ -1986,7 +2086,7 @@
                       </mc:Choice>
                       <mc:Fallback>
                         <w:pict>
-                          <v:line w14:anchorId="5893574D" id="Straight Connector 1" o:spid="_x0000_s1026" style="position:absolute;z-index:251689984;visibility:visible;mso-wrap-style:square;mso-width-percent:0;mso-wrap-distance-left:9pt;mso-wrap-distance-top:0;mso-wrap-distance-right:9pt;mso-wrap-distance-bottom:0;mso-position-horizontal:absolute;mso-position-horizontal-relative:text;mso-position-vertical:absolute;mso-position-vertical-relative:text;mso-width-percent:0;mso-width-relative:margin" from="23.5pt,8.35pt" to="143.7pt,8.35pt" o:gfxdata="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" strokecolor="windowText" strokeweight=".5pt">
+                          <v:line w14:anchorId="51B79D48" id="Straight Connector 1" o:spid="_x0000_s1026" style="position:absolute;z-index:251689984;visibility:visible;mso-wrap-style:square;mso-width-percent:0;mso-wrap-distance-left:9pt;mso-wrap-distance-top:0;mso-wrap-distance-right:9pt;mso-wrap-distance-bottom:0;mso-position-horizontal:absolute;mso-position-horizontal-relative:text;mso-position-vertical:absolute;mso-position-vertical-relative:text;mso-width-percent:0;mso-width-relative:margin" from="23.5pt,8.35pt" to="143.7pt,8.35pt" o:gfxdata="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" strokecolor="windowText" strokeweight=".5pt">
                             <v:stroke joinstyle="miter"/>
                           </v:line>
                         </w:pict>
@@ -2096,7 +2196,7 @@
                       </mc:Choice>
                       <mc:Fallback>
                         <w:pict>
-                          <v:line w14:anchorId="611DF4E9" id="Straight Connector 2" o:spid="_x0000_s1026" style="position:absolute;z-index:251691008;visibility:visible;mso-wrap-style:square;mso-wrap-distance-left:9pt;mso-wrap-distance-top:0;mso-wrap-distance-right:9pt;mso-wrap-distance-bottom:0;mso-position-horizontal:absolute;mso-position-horizontal-relative:text;mso-position-vertical:absolute;mso-position-vertical-relative:text" from="31.2pt,8.35pt" to="143.25pt,8.35pt" o:gfxdata="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" strokecolor="windowText" strokeweight=".5pt">
+                          <v:line w14:anchorId="08194A7C" id="Straight Connector 2" o:spid="_x0000_s1026" style="position:absolute;z-index:251691008;visibility:visible;mso-wrap-style:square;mso-wrap-distance-left:9pt;mso-wrap-distance-top:0;mso-wrap-distance-right:9pt;mso-wrap-distance-bottom:0;mso-position-horizontal:absolute;mso-position-horizontal-relative:text;mso-position-vertical:absolute;mso-position-vertical-relative:text" from="31.2pt,8.35pt" to="143.25pt,8.35pt" o:gfxdata="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" strokecolor="windowText" strokeweight=".5pt">
                             <v:stroke joinstyle="miter"/>
                           </v:line>
                         </w:pict>
@@ -2270,7 +2370,7 @@
 </file>
 
 <file path=word/endnotes.xml><?xml version="1.0" encoding="utf-8"?>
-<w:endnotes xmlns:wpc="http://schemas.microsoft.com/office/word/2010/wordprocessingCanvas" xmlns:cx="http://schemas.microsoft.com/office/drawing/2014/chartex" xmlns:cx1="http://schemas.microsoft.com/office/drawing/2015/9/8/chartex" xmlns:cx2="http://schemas.microsoft.com/office/drawing/2015/10/21/chartex" xmlns:cx3="http://schemas.microsoft.com/office/drawing/2016/5/9/chartex" xmlns:cx4="http://schemas.microsoft.com/office/drawing/2016/5/10/chartex" xmlns:cx5="http://schemas.microsoft.com/office/drawing/2016/5/11/chartex" xmlns:cx6="http://schemas.microsoft.com/office/drawing/2016/5/12/chartex" xmlns:cx7="http://schemas.microsoft.com/office/drawing/2016/5/13/chartex" xmlns:cx8="http://schemas.microsoft.com/office/drawing/2016/5/14/chartex" xmlns:mc="http://schemas.openxmlformats.org/markup-compatibility/2006" xmlns:aink="http://schemas.microsoft.com/office/drawing/2016/ink" xmlns:am3d="http://schemas.microsoft.com/office/drawing/2017/model3d" xmlns:o="urn:schemas-microsoft-com:office:office" xmlns:oel="http://schemas.microsoft.com/office/2019/extlst" xmlns:r="http://schemas.openxmlformats.org/officeDocument/2006/relationships" xmlns:m="http://schemas.openxmlformats.org/officeDocument/2006/math" xmlns:v="urn:schemas-microsoft-com:vml" xmlns:wp14="http://schemas.microsoft.com/office/word/2010/wordprocessingDrawing" xmlns:wp="http://schemas.openxmlformats.org/drawingml/2006/wordprocessingDrawing" xmlns:w10="urn:schemas-microsoft-com:office:word" xmlns:w="http://schemas.openxmlformats.org/wordprocessingml/2006/main" xmlns:w14="http://schemas.microsoft.com/office/word/2010/wordml" xmlns:w15="http://schemas.microsoft.com/office/word/2012/wordml" xmlns:w16cex="http://schemas.microsoft.com/office/word/2018/wordml/cex" xmlns:w16cid="http://schemas.microsoft.com/office/word/2016/wordml/cid" xmlns:w16="http://schemas.microsoft.com/office/word/2018/wordml" xmlns:w16sdtdh="http://schemas.microsoft.com/office/word/2020/wordml/sdtdatahash" xmlns:w16se="http://schemas.microsoft.com/office/word/2015/wordml/symex" xmlns:wpg="http://schemas.microsoft.com/office/word/2010/wordprocessingGroup" xmlns:wpi="http://schemas.microsoft.com/office/word/2010/wordprocessingInk" xmlns:wne="http://schemas.microsoft.com/office/word/2006/wordml" xmlns:wps="http://schemas.microsoft.com/office/word/2010/wordprocessingShape" mc:Ignorable="w14 w15 w16se w16cid w16 w16cex w16sdtdh wp14">
+<w:endnotes xmlns:wpc="http://schemas.microsoft.com/office/word/2010/wordprocessingCanvas" xmlns:cx="http://schemas.microsoft.com/office/drawing/2014/chartex" xmlns:cx1="http://schemas.microsoft.com/office/drawing/2015/9/8/chartex" xmlns:cx2="http://schemas.microsoft.com/office/drawing/2015/10/21/chartex" xmlns:cx3="http://schemas.microsoft.com/office/drawing/2016/5/9/chartex" xmlns:cx4="http://schemas.microsoft.com/office/drawing/2016/5/10/chartex" xmlns:cx5="http://schemas.microsoft.com/office/drawing/2016/5/11/chartex" xmlns:cx6="http://schemas.microsoft.com/office/drawing/2016/5/12/chartex" xmlns:cx7="http://schemas.microsoft.com/office/drawing/2016/5/13/chartex" xmlns:cx8="http://schemas.microsoft.com/office/drawing/2016/5/14/chartex" xmlns:mc="http://schemas.openxmlformats.org/markup-compatibility/2006" xmlns:aink="http://schemas.microsoft.com/office/drawing/2016/ink" xmlns:am3d="http://schemas.microsoft.com/office/drawing/2017/model3d" xmlns:o="urn:schemas-microsoft-com:office:office" xmlns:oel="http://schemas.microsoft.com/office/2019/extlst" xmlns:r="http://schemas.openxmlformats.org/officeDocument/2006/relationships" xmlns:m="http://schemas.openxmlformats.org/officeDocument/2006/math" xmlns:v="urn:schemas-microsoft-com:vml" xmlns:wp14="http://schemas.microsoft.com/office/word/2010/wordprocessingDrawing" xmlns:wp="http://schemas.openxmlformats.org/drawingml/2006/wordprocessingDrawing" xmlns:w10="urn:schemas-microsoft-com:office:word" xmlns:w="http://schemas.openxmlformats.org/wordprocessingml/2006/main" xmlns:w14="http://schemas.microsoft.com/office/word/2010/wordml" xmlns:w15="http://schemas.microsoft.com/office/word/2012/wordml" xmlns:w16cex="http://schemas.microsoft.com/office/word/2018/wordml/cex" xmlns:w16cid="http://schemas.microsoft.com/office/word/2016/wordml/cid" xmlns:w16="http://schemas.microsoft.com/office/word/2018/wordml" xmlns:w16du="http://schemas.microsoft.com/office/word/2023/wordml/word16du" xmlns:w16sdtdh="http://schemas.microsoft.com/office/word/2020/wordml/sdtdatahash" xmlns:w16se="http://schemas.microsoft.com/office/word/2015/wordml/symex" xmlns:wpg="http://schemas.microsoft.com/office/word/2010/wordprocessingGroup" xmlns:wpi="http://schemas.microsoft.com/office/word/2010/wordprocessingInk" xmlns:wne="http://schemas.microsoft.com/office/word/2006/wordml" xmlns:wps="http://schemas.microsoft.com/office/word/2010/wordprocessingShape" mc:Ignorable="w14 w15 w16se w16cid w16 w16cex w16sdtdh wp14">
   <w:endnote w:type="separator" w:id="-1">
     <w:p>
       <w:r>
@@ -2289,7 +2389,7 @@
 </file>
 
 <file path=word/footer1.xml><?xml version="1.0" encoding="utf-8"?>
-<w:ftr xmlns:wpc="http://schemas.microsoft.com/office/word/2010/wordprocessingCanvas" xmlns:cx="http://schemas.microsoft.com/office/drawing/2014/chartex" xmlns:cx1="http://schemas.microsoft.com/office/drawing/2015/9/8/chartex" xmlns:cx2="http://schemas.microsoft.com/office/drawing/2015/10/21/chartex" xmlns:cx3="http://schemas.microsoft.com/office/drawing/2016/5/9/chartex" xmlns:cx4="http://schemas.microsoft.com/office/drawing/2016/5/10/chartex" xmlns:cx5="http://schemas.microsoft.com/office/drawing/2016/5/11/chartex" xmlns:cx6="http://schemas.microsoft.com/office/drawing/2016/5/12/chartex" xmlns:cx7="http://schemas.microsoft.com/office/drawing/2016/5/13/chartex" xmlns:cx8="http://schemas.microsoft.com/office/drawing/2016/5/14/chartex" xmlns:mc="http://schemas.openxmlformats.org/markup-compatibility/2006" xmlns:aink="http://schemas.microsoft.com/office/drawing/2016/ink" xmlns:am3d="http://schemas.microsoft.com/office/drawing/2017/model3d" xmlns:o="urn:schemas-microsoft-com:office:office" xmlns:oel="http://schemas.microsoft.com/office/2019/extlst" xmlns:r="http://schemas.openxmlformats.org/officeDocument/2006/relationships" xmlns:m="http://schemas.openxmlformats.org/officeDocument/2006/math" xmlns:v="urn:schemas-microsoft-com:vml" xmlns:wp14="http://schemas.microsoft.com/office/word/2010/wordprocessingDrawing" xmlns:wp="http://schemas.openxmlformats.org/drawingml/2006/wordprocessingDrawing" xmlns:w10="urn:schemas-microsoft-com:office:word" xmlns:w="http://schemas.openxmlformats.org/wordprocessingml/2006/main" xmlns:w14="http://schemas.microsoft.com/office/word/2010/wordml" xmlns:w15="http://schemas.microsoft.com/office/word/2012/wordml" xmlns:w16cex="http://schemas.microsoft.com/office/word/2018/wordml/cex" xmlns:w16cid="http://schemas.microsoft.com/office/word/2016/wordml/cid" xmlns:w16="http://schemas.microsoft.com/office/word/2018/wordml" xmlns:w16sdtdh="http://schemas.microsoft.com/office/word/2020/wordml/sdtdatahash" xmlns:w16se="http://schemas.microsoft.com/office/word/2015/wordml/symex" xmlns:wpg="http://schemas.microsoft.com/office/word/2010/wordprocessingGroup" xmlns:wpi="http://schemas.microsoft.com/office/word/2010/wordprocessingInk" xmlns:wne="http://schemas.microsoft.com/office/word/2006/wordml" xmlns:wps="http://schemas.microsoft.com/office/word/2010/wordprocessingShape" mc:Ignorable="w14 w15 w16se w16cid w16 w16cex w16sdtdh wp14">
+<w:ftr xmlns:wpc="http://schemas.microsoft.com/office/word/2010/wordprocessingCanvas" xmlns:cx="http://schemas.microsoft.com/office/drawing/2014/chartex" xmlns:cx1="http://schemas.microsoft.com/office/drawing/2015/9/8/chartex" xmlns:cx2="http://schemas.microsoft.com/office/drawing/2015/10/21/chartex" xmlns:cx3="http://schemas.microsoft.com/office/drawing/2016/5/9/chartex" xmlns:cx4="http://schemas.microsoft.com/office/drawing/2016/5/10/chartex" xmlns:cx5="http://schemas.microsoft.com/office/drawing/2016/5/11/chartex" xmlns:cx6="http://schemas.microsoft.com/office/drawing/2016/5/12/chartex" xmlns:cx7="http://schemas.microsoft.com/office/drawing/2016/5/13/chartex" xmlns:cx8="http://schemas.microsoft.com/office/drawing/2016/5/14/chartex" xmlns:mc="http://schemas.openxmlformats.org/markup-compatibility/2006" xmlns:aink="http://schemas.microsoft.com/office/drawing/2016/ink" xmlns:am3d="http://schemas.microsoft.com/office/drawing/2017/model3d" xmlns:o="urn:schemas-microsoft-com:office:office" xmlns:oel="http://schemas.microsoft.com/office/2019/extlst" xmlns:r="http://schemas.openxmlformats.org/officeDocument/2006/relationships" xmlns:m="http://schemas.openxmlformats.org/officeDocument/2006/math" xmlns:v="urn:schemas-microsoft-com:vml" xmlns:wp14="http://schemas.microsoft.com/office/word/2010/wordprocessingDrawing" xmlns:wp="http://schemas.openxmlformats.org/drawingml/2006/wordprocessingDrawing" xmlns:w10="urn:schemas-microsoft-com:office:word" xmlns:w="http://schemas.openxmlformats.org/wordprocessingml/2006/main" xmlns:w14="http://schemas.microsoft.com/office/word/2010/wordml" xmlns:w15="http://schemas.microsoft.com/office/word/2012/wordml" xmlns:w16cex="http://schemas.microsoft.com/office/word/2018/wordml/cex" xmlns:w16cid="http://schemas.microsoft.com/office/word/2016/wordml/cid" xmlns:w16="http://schemas.microsoft.com/office/word/2018/wordml" xmlns:w16du="http://schemas.microsoft.com/office/word/2023/wordml/word16du" xmlns:w16sdtdh="http://schemas.microsoft.com/office/word/2020/wordml/sdtdatahash" xmlns:w16se="http://schemas.microsoft.com/office/word/2015/wordml/symex" xmlns:wpg="http://schemas.microsoft.com/office/word/2010/wordprocessingGroup" xmlns:wpi="http://schemas.microsoft.com/office/word/2010/wordprocessingInk" xmlns:wne="http://schemas.microsoft.com/office/word/2006/wordml" xmlns:wps="http://schemas.microsoft.com/office/word/2010/wordprocessingShape" mc:Ignorable="w14 w15 w16se w16cid w16 w16cex w16sdtdh wp14">
   <w:p>
     <w:pPr>
       <w:pStyle w:val="Footer"/>
@@ -2299,7 +2399,7 @@
 </file>
 
 <file path=word/footer2.xml><?xml version="1.0" encoding="utf-8"?>
-<w:ftr xmlns:wpc="http://schemas.microsoft.com/office/word/2010/wordprocessingCanvas" xmlns:cx="http://schemas.microsoft.com/office/drawing/2014/chartex" xmlns:cx1="http://schemas.microsoft.com/office/drawing/2015/9/8/chartex" xmlns:cx2="http://schemas.microsoft.com/office/drawing/2015/10/21/chartex" xmlns:cx3="http://schemas.microsoft.com/office/drawing/2016/5/9/chartex" xmlns:cx4="http://schemas.microsoft.com/office/drawing/2016/5/10/chartex" xmlns:cx5="http://schemas.microsoft.com/office/drawing/2016/5/11/chartex" xmlns:cx6="http://schemas.microsoft.com/office/drawing/2016/5/12/chartex" xmlns:cx7="http://schemas.microsoft.com/office/drawing/2016/5/13/chartex" xmlns:cx8="http://schemas.microsoft.com/office/drawing/2016/5/14/chartex" xmlns:mc="http://schemas.openxmlformats.org/markup-compatibility/2006" xmlns:aink="http://schemas.microsoft.com/office/drawing/2016/ink" xmlns:am3d="http://schemas.microsoft.com/office/drawing/2017/model3d" xmlns:o="urn:schemas-microsoft-com:office:office" xmlns:oel="http://schemas.microsoft.com/office/2019/extlst" xmlns:r="http://schemas.openxmlformats.org/officeDocument/2006/relationships" xmlns:m="http://schemas.openxmlformats.org/officeDocument/2006/math" xmlns:v="urn:schemas-microsoft-com:vml" xmlns:wp14="http://schemas.microsoft.com/office/word/2010/wordprocessingDrawing" xmlns:wp="http://schemas.openxmlformats.org/drawingml/2006/wordprocessingDrawing" xmlns:w10="urn:schemas-microsoft-com:office:word" xmlns:w="http://schemas.openxmlformats.org/wordprocessingml/2006/main" xmlns:w14="http://schemas.microsoft.com/office/word/2010/wordml" xmlns:w15="http://schemas.microsoft.com/office/word/2012/wordml" xmlns:w16cex="http://schemas.microsoft.com/office/word/2018/wordml/cex" xmlns:w16cid="http://schemas.microsoft.com/office/word/2016/wordml/cid" xmlns:w16="http://schemas.microsoft.com/office/word/2018/wordml" xmlns:w16sdtdh="http://schemas.microsoft.com/office/word/2020/wordml/sdtdatahash" xmlns:w16se="http://schemas.microsoft.com/office/word/2015/wordml/symex" xmlns:wpg="http://schemas.microsoft.com/office/word/2010/wordprocessingGroup" xmlns:wpi="http://schemas.microsoft.com/office/word/2010/wordprocessingInk" xmlns:wne="http://schemas.microsoft.com/office/word/2006/wordml" xmlns:wps="http://schemas.microsoft.com/office/word/2010/wordprocessingShape" mc:Ignorable="w14 w15 w16se w16cid w16 w16cex w16sdtdh wp14">
+<w:ftr xmlns:wpc="http://schemas.microsoft.com/office/word/2010/wordprocessingCanvas" xmlns:cx="http://schemas.microsoft.com/office/drawing/2014/chartex" xmlns:cx1="http://schemas.microsoft.com/office/drawing/2015/9/8/chartex" xmlns:cx2="http://schemas.microsoft.com/office/drawing/2015/10/21/chartex" xmlns:cx3="http://schemas.microsoft.com/office/drawing/2016/5/9/chartex" xmlns:cx4="http://schemas.microsoft.com/office/drawing/2016/5/10/chartex" xmlns:cx5="http://schemas.microsoft.com/office/drawing/2016/5/11/chartex" xmlns:cx6="http://schemas.microsoft.com/office/drawing/2016/5/12/chartex" xmlns:cx7="http://schemas.microsoft.com/office/drawing/2016/5/13/chartex" xmlns:cx8="http://schemas.microsoft.com/office/drawing/2016/5/14/chartex" xmlns:mc="http://schemas.openxmlformats.org/markup-compatibility/2006" xmlns:aink="http://schemas.microsoft.com/office/drawing/2016/ink" xmlns:am3d="http://schemas.microsoft.com/office/drawing/2017/model3d" xmlns:o="urn:schemas-microsoft-com:office:office" xmlns:oel="http://schemas.microsoft.com/office/2019/extlst" xmlns:r="http://schemas.openxmlformats.org/officeDocument/2006/relationships" xmlns:m="http://schemas.openxmlformats.org/officeDocument/2006/math" xmlns:v="urn:schemas-microsoft-com:vml" xmlns:wp14="http://schemas.microsoft.com/office/word/2010/wordprocessingDrawing" xmlns:wp="http://schemas.openxmlformats.org/drawingml/2006/wordprocessingDrawing" xmlns:w10="urn:schemas-microsoft-com:office:word" xmlns:w="http://schemas.openxmlformats.org/wordprocessingml/2006/main" xmlns:w14="http://schemas.microsoft.com/office/word/2010/wordml" xmlns:w15="http://schemas.microsoft.com/office/word/2012/wordml" xmlns:w16cex="http://schemas.microsoft.com/office/word/2018/wordml/cex" xmlns:w16cid="http://schemas.microsoft.com/office/word/2016/wordml/cid" xmlns:w16="http://schemas.microsoft.com/office/word/2018/wordml" xmlns:w16du="http://schemas.microsoft.com/office/word/2023/wordml/word16du" xmlns:w16sdtdh="http://schemas.microsoft.com/office/word/2020/wordml/sdtdatahash" xmlns:w16se="http://schemas.microsoft.com/office/word/2015/wordml/symex" xmlns:wpg="http://schemas.microsoft.com/office/word/2010/wordprocessingGroup" xmlns:wpi="http://schemas.microsoft.com/office/word/2010/wordprocessingInk" xmlns:wne="http://schemas.microsoft.com/office/word/2006/wordml" xmlns:wps="http://schemas.microsoft.com/office/word/2010/wordprocessingShape" mc:Ignorable="w14 w15 w16se w16cid w16 w16cex w16sdtdh wp14">
   <w:sdt>
     <w:sdtPr>
       <w:id w:val="1647311531"/>
@@ -2518,7 +2618,7 @@
 </file>
 
 <file path=word/footer3.xml><?xml version="1.0" encoding="utf-8"?>
-<w:ftr xmlns:wpc="http://schemas.microsoft.com/office/word/2010/wordprocessingCanvas" xmlns:cx="http://schemas.microsoft.com/office/drawing/2014/chartex" xmlns:cx1="http://schemas.microsoft.com/office/drawing/2015/9/8/chartex" xmlns:cx2="http://schemas.microsoft.com/office/drawing/2015/10/21/chartex" xmlns:cx3="http://schemas.microsoft.com/office/drawing/2016/5/9/chartex" xmlns:cx4="http://schemas.microsoft.com/office/drawing/2016/5/10/chartex" xmlns:cx5="http://schemas.microsoft.com/office/drawing/2016/5/11/chartex" xmlns:cx6="http://schemas.microsoft.com/office/drawing/2016/5/12/chartex" xmlns:cx7="http://schemas.microsoft.com/office/drawing/2016/5/13/chartex" xmlns:cx8="http://schemas.microsoft.com/office/drawing/2016/5/14/chartex" xmlns:mc="http://schemas.openxmlformats.org/markup-compatibility/2006" xmlns:aink="http://schemas.microsoft.com/office/drawing/2016/ink" xmlns:am3d="http://schemas.microsoft.com/office/drawing/2017/model3d" xmlns:o="urn:schemas-microsoft-com:office:office" xmlns:oel="http://schemas.microsoft.com/office/2019/extlst" xmlns:r="http://schemas.openxmlformats.org/officeDocument/2006/relationships" xmlns:m="http://schemas.openxmlformats.org/officeDocument/2006/math" xmlns:v="urn:schemas-microsoft-com:vml" xmlns:wp14="http://schemas.microsoft.com/office/word/2010/wordprocessingDrawing" xmlns:wp="http://schemas.openxmlformats.org/drawingml/2006/wordprocessingDrawing" xmlns:w10="urn:schemas-microsoft-com:office:word" xmlns:w="http://schemas.openxmlformats.org/wordprocessingml/2006/main" xmlns:w14="http://schemas.microsoft.com/office/word/2010/wordml" xmlns:w15="http://schemas.microsoft.com/office/word/2012/wordml" xmlns:w16cex="http://schemas.microsoft.com/office/word/2018/wordml/cex" xmlns:w16cid="http://schemas.microsoft.com/office/word/2016/wordml/cid" xmlns:w16="http://schemas.microsoft.com/office/word/2018/wordml" xmlns:w16sdtdh="http://schemas.microsoft.com/office/word/2020/wordml/sdtdatahash" xmlns:w16se="http://schemas.microsoft.com/office/word/2015/wordml/symex" xmlns:wpg="http://schemas.microsoft.com/office/word/2010/wordprocessingGroup" xmlns:wpi="http://schemas.microsoft.com/office/word/2010/wordprocessingInk" xmlns:wne="http://schemas.microsoft.com/office/word/2006/wordml" xmlns:wps="http://schemas.microsoft.com/office/word/2010/wordprocessingShape" mc:Ignorable="w14 w15 w16se w16cid w16 w16cex w16sdtdh wp14">
+<w:ftr xmlns:wpc="http://schemas.microsoft.com/office/word/2010/wordprocessingCanvas" xmlns:cx="http://schemas.microsoft.com/office/drawing/2014/chartex" xmlns:cx1="http://schemas.microsoft.com/office/drawing/2015/9/8/chartex" xmlns:cx2="http://schemas.microsoft.com/office/drawing/2015/10/21/chartex" xmlns:cx3="http://schemas.microsoft.com/office/drawing/2016/5/9/chartex" xmlns:cx4="http://schemas.microsoft.com/office/drawing/2016/5/10/chartex" xmlns:cx5="http://schemas.microsoft.com/office/drawing/2016/5/11/chartex" xmlns:cx6="http://schemas.microsoft.com/office/drawing/2016/5/12/chartex" xmlns:cx7="http://schemas.microsoft.com/office/drawing/2016/5/13/chartex" xmlns:cx8="http://schemas.microsoft.com/office/drawing/2016/5/14/chartex" xmlns:mc="http://schemas.openxmlformats.org/markup-compatibility/2006" xmlns:aink="http://schemas.microsoft.com/office/drawing/2016/ink" xmlns:am3d="http://schemas.microsoft.com/office/drawing/2017/model3d" xmlns:o="urn:schemas-microsoft-com:office:office" xmlns:oel="http://schemas.microsoft.com/office/2019/extlst" xmlns:r="http://schemas.openxmlformats.org/officeDocument/2006/relationships" xmlns:m="http://schemas.openxmlformats.org/officeDocument/2006/math" xmlns:v="urn:schemas-microsoft-com:vml" xmlns:wp14="http://schemas.microsoft.com/office/word/2010/wordprocessingDrawing" xmlns:wp="http://schemas.openxmlformats.org/drawingml/2006/wordprocessingDrawing" xmlns:w10="urn:schemas-microsoft-com:office:word" xmlns:w="http://schemas.openxmlformats.org/wordprocessingml/2006/main" xmlns:w14="http://schemas.microsoft.com/office/word/2010/wordml" xmlns:w15="http://schemas.microsoft.com/office/word/2012/wordml" xmlns:w16cex="http://schemas.microsoft.com/office/word/2018/wordml/cex" xmlns:w16cid="http://schemas.microsoft.com/office/word/2016/wordml/cid" xmlns:w16="http://schemas.microsoft.com/office/word/2018/wordml" xmlns:w16du="http://schemas.microsoft.com/office/word/2023/wordml/word16du" xmlns:w16sdtdh="http://schemas.microsoft.com/office/word/2020/wordml/sdtdatahash" xmlns:w16se="http://schemas.microsoft.com/office/word/2015/wordml/symex" xmlns:wpg="http://schemas.microsoft.com/office/word/2010/wordprocessingGroup" xmlns:wpi="http://schemas.microsoft.com/office/word/2010/wordprocessingInk" xmlns:wne="http://schemas.microsoft.com/office/word/2006/wordml" xmlns:wps="http://schemas.microsoft.com/office/word/2010/wordprocessingShape" mc:Ignorable="w14 w15 w16se w16cid w16 w16cex w16sdtdh wp14">
   <w:p>
     <w:pPr>
       <w:pStyle w:val="Footer"/>
@@ -2528,7 +2628,7 @@
 </file>
 
 <file path=word/footnotes.xml><?xml version="1.0" encoding="utf-8"?>
-<w:footnotes xmlns:wpc="http://schemas.microsoft.com/office/word/2010/wordprocessingCanvas" xmlns:cx="http://schemas.microsoft.com/office/drawing/2014/chartex" xmlns:cx1="http://schemas.microsoft.com/office/drawing/2015/9/8/chartex" xmlns:cx2="http://schemas.microsoft.com/office/drawing/2015/10/21/chartex" xmlns:cx3="http://schemas.microsoft.com/office/drawing/2016/5/9/chartex" xmlns:cx4="http://schemas.microsoft.com/office/drawing/2016/5/10/chartex" xmlns:cx5="http://schemas.microsoft.com/office/drawing/2016/5/11/chartex" xmlns:cx6="http://schemas.microsoft.com/office/drawing/2016/5/12/chartex" xmlns:cx7="http://schemas.microsoft.com/office/drawing/2016/5/13/chartex" xmlns:cx8="http://schemas.microsoft.com/office/drawing/2016/5/14/chartex" xmlns:mc="http://schemas.openxmlformats.org/markup-compatibility/2006" xmlns:aink="http://schemas.microsoft.com/office/drawing/2016/ink" xmlns:am3d="http://schemas.microsoft.com/office/drawing/2017/model3d" xmlns:o="urn:schemas-microsoft-com:office:office" xmlns:oel="http://schemas.microsoft.com/office/2019/extlst" xmlns:r="http://schemas.openxmlformats.org/officeDocument/2006/relationships" xmlns:m="http://schemas.openxmlformats.org/officeDocument/2006/math" xmlns:v="urn:schemas-microsoft-com:vml" xmlns:wp14="http://schemas.microsoft.com/office/word/2010/wordprocessingDrawing" xmlns:wp="http://schemas.openxmlformats.org/drawingml/2006/wordprocessingDrawing" xmlns:w10="urn:schemas-microsoft-com:office:word" xmlns:w="http://schemas.openxmlformats.org/wordprocessingml/2006/main" xmlns:w14="http://schemas.microsoft.com/office/word/2010/wordml" xmlns:w15="http://schemas.microsoft.com/office/word/2012/wordml" xmlns:w16cex="http://schemas.microsoft.com/office/word/2018/wordml/cex" xmlns:w16cid="http://schemas.microsoft.com/office/word/2016/wordml/cid" xmlns:w16="http://schemas.microsoft.com/office/word/2018/wordml" xmlns:w16sdtdh="http://schemas.microsoft.com/office/word/2020/wordml/sdtdatahash" xmlns:w16se="http://schemas.microsoft.com/office/word/2015/wordml/symex" xmlns:wpg="http://schemas.microsoft.com/office/word/2010/wordprocessingGroup" xmlns:wpi="http://schemas.microsoft.com/office/word/2010/wordprocessingInk" xmlns:wne="http://schemas.microsoft.com/office/word/2006/wordml" xmlns:wps="http://schemas.microsoft.com/office/word/2010/wordprocessingShape" mc:Ignorable="w14 w15 w16se w16cid w16 w16cex w16sdtdh wp14">
+<w:footnotes xmlns:wpc="http://schemas.microsoft.com/office/word/2010/wordprocessingCanvas" xmlns:cx="http://schemas.microsoft.com/office/drawing/2014/chartex" xmlns:cx1="http://schemas.microsoft.com/office/drawing/2015/9/8/chartex" xmlns:cx2="http://schemas.microsoft.com/office/drawing/2015/10/21/chartex" xmlns:cx3="http://schemas.microsoft.com/office/drawing/2016/5/9/chartex" xmlns:cx4="http://schemas.microsoft.com/office/drawing/2016/5/10/chartex" xmlns:cx5="http://schemas.microsoft.com/office/drawing/2016/5/11/chartex" xmlns:cx6="http://schemas.microsoft.com/office/drawing/2016/5/12/chartex" xmlns:cx7="http://schemas.microsoft.com/office/drawing/2016/5/13/chartex" xmlns:cx8="http://schemas.microsoft.com/office/drawing/2016/5/14/chartex" xmlns:mc="http://schemas.openxmlformats.org/markup-compatibility/2006" xmlns:aink="http://schemas.microsoft.com/office/drawing/2016/ink" xmlns:am3d="http://schemas.microsoft.com/office/drawing/2017/model3d" xmlns:o="urn:schemas-microsoft-com:office:office" xmlns:oel="http://schemas.microsoft.com/office/2019/extlst" xmlns:r="http://schemas.openxmlformats.org/officeDocument/2006/relationships" xmlns:m="http://schemas.openxmlformats.org/officeDocument/2006/math" xmlns:v="urn:schemas-microsoft-com:vml" xmlns:wp14="http://schemas.microsoft.com/office/word/2010/wordprocessingDrawing" xmlns:wp="http://schemas.openxmlformats.org/drawingml/2006/wordprocessingDrawing" xmlns:w10="urn:schemas-microsoft-com:office:word" xmlns:w="http://schemas.openxmlformats.org/wordprocessingml/2006/main" xmlns:w14="http://schemas.microsoft.com/office/word/2010/wordml" xmlns:w15="http://schemas.microsoft.com/office/word/2012/wordml" xmlns:w16cex="http://schemas.microsoft.com/office/word/2018/wordml/cex" xmlns:w16cid="http://schemas.microsoft.com/office/word/2016/wordml/cid" xmlns:w16="http://schemas.microsoft.com/office/word/2018/wordml" xmlns:w16du="http://schemas.microsoft.com/office/word/2023/wordml/word16du" xmlns:w16sdtdh="http://schemas.microsoft.com/office/word/2020/wordml/sdtdatahash" xmlns:w16se="http://schemas.microsoft.com/office/word/2015/wordml/symex" xmlns:wpg="http://schemas.microsoft.com/office/word/2010/wordprocessingGroup" xmlns:wpi="http://schemas.microsoft.com/office/word/2010/wordprocessingInk" xmlns:wne="http://schemas.microsoft.com/office/word/2006/wordml" xmlns:wps="http://schemas.microsoft.com/office/word/2010/wordprocessingShape" mc:Ignorable="w14 w15 w16se w16cid w16 w16cex w16sdtdh wp14">
   <w:footnote w:type="separator" w:id="-1">
     <w:p>
       <w:r>
@@ -2547,7 +2647,7 @@
 </file>
 
 <file path=word/header1.xml><?xml version="1.0" encoding="utf-8"?>
-<w:hdr xmlns:wpc="http://schemas.microsoft.com/office/word/2010/wordprocessingCanvas" xmlns:cx="http://schemas.microsoft.com/office/drawing/2014/chartex" xmlns:cx1="http://schemas.microsoft.com/office/drawing/2015/9/8/chartex" xmlns:cx2="http://schemas.microsoft.com/office/drawing/2015/10/21/chartex" xmlns:cx3="http://schemas.microsoft.com/office/drawing/2016/5/9/chartex" xmlns:cx4="http://schemas.microsoft.com/office/drawing/2016/5/10/chartex" xmlns:cx5="http://schemas.microsoft.com/office/drawing/2016/5/11/chartex" xmlns:cx6="http://schemas.microsoft.com/office/drawing/2016/5/12/chartex" xmlns:cx7="http://schemas.microsoft.com/office/drawing/2016/5/13/chartex" xmlns:cx8="http://schemas.microsoft.com/office/drawing/2016/5/14/chartex" xmlns:mc="http://schemas.openxmlformats.org/markup-compatibility/2006" xmlns:aink="http://schemas.microsoft.com/office/drawing/2016/ink" xmlns:am3d="http://schemas.microsoft.com/office/drawing/2017/model3d" xmlns:o="urn:schemas-microsoft-com:office:office" xmlns:oel="http://schemas.microsoft.com/office/2019/extlst" xmlns:r="http://schemas.openxmlformats.org/officeDocument/2006/relationships" xmlns:m="http://schemas.openxmlformats.org/officeDocument/2006/math" xmlns:v="urn:schemas-microsoft-com:vml" xmlns:wp14="http://schemas.microsoft.com/office/word/2010/wordprocessingDrawing" xmlns:wp="http://schemas.openxmlformats.org/drawingml/2006/wordprocessingDrawing" xmlns:w10="urn:schemas-microsoft-com:office:word" xmlns:w="http://schemas.openxmlformats.org/wordprocessingml/2006/main" xmlns:w14="http://schemas.microsoft.com/office/word/2010/wordml" xmlns:w15="http://schemas.microsoft.com/office/word/2012/wordml" xmlns:w16cex="http://schemas.microsoft.com/office/word/2018/wordml/cex" xmlns:w16cid="http://schemas.microsoft.com/office/word/2016/wordml/cid" xmlns:w16="http://schemas.microsoft.com/office/word/2018/wordml" xmlns:w16sdtdh="http://schemas.microsoft.com/office/word/2020/wordml/sdtdatahash" xmlns:w16se="http://schemas.microsoft.com/office/word/2015/wordml/symex" xmlns:wpg="http://schemas.microsoft.com/office/word/2010/wordprocessingGroup" xmlns:wpi="http://schemas.microsoft.com/office/word/2010/wordprocessingInk" xmlns:wne="http://schemas.microsoft.com/office/word/2006/wordml" xmlns:wps="http://schemas.microsoft.com/office/word/2010/wordprocessingShape" mc:Ignorable="w14 w15 w16se w16cid w16 w16cex w16sdtdh wp14">
+<w:hdr xmlns:wpc="http://schemas.microsoft.com/office/word/2010/wordprocessingCanvas" xmlns:cx="http://schemas.microsoft.com/office/drawing/2014/chartex" xmlns:cx1="http://schemas.microsoft.com/office/drawing/2015/9/8/chartex" xmlns:cx2="http://schemas.microsoft.com/office/drawing/2015/10/21/chartex" xmlns:cx3="http://schemas.microsoft.com/office/drawing/2016/5/9/chartex" xmlns:cx4="http://schemas.microsoft.com/office/drawing/2016/5/10/chartex" xmlns:cx5="http://schemas.microsoft.com/office/drawing/2016/5/11/chartex" xmlns:cx6="http://schemas.microsoft.com/office/drawing/2016/5/12/chartex" xmlns:cx7="http://schemas.microsoft.com/office/drawing/2016/5/13/chartex" xmlns:cx8="http://schemas.microsoft.com/office/drawing/2016/5/14/chartex" xmlns:mc="http://schemas.openxmlformats.org/markup-compatibility/2006" xmlns:aink="http://schemas.microsoft.com/office/drawing/2016/ink" xmlns:am3d="http://schemas.microsoft.com/office/drawing/2017/model3d" xmlns:o="urn:schemas-microsoft-com:office:office" xmlns:oel="http://schemas.microsoft.com/office/2019/extlst" xmlns:r="http://schemas.openxmlformats.org/officeDocument/2006/relationships" xmlns:m="http://schemas.openxmlformats.org/officeDocument/2006/math" xmlns:v="urn:schemas-microsoft-com:vml" xmlns:wp14="http://schemas.microsoft.com/office/word/2010/wordprocessingDrawing" xmlns:wp="http://schemas.openxmlformats.org/drawingml/2006/wordprocessingDrawing" xmlns:w10="urn:schemas-microsoft-com:office:word" xmlns:w="http://schemas.openxmlformats.org/wordprocessingml/2006/main" xmlns:w14="http://schemas.microsoft.com/office/word/2010/wordml" xmlns:w15="http://schemas.microsoft.com/office/word/2012/wordml" xmlns:w16cex="http://schemas.microsoft.com/office/word/2018/wordml/cex" xmlns:w16cid="http://schemas.microsoft.com/office/word/2016/wordml/cid" xmlns:w16="http://schemas.microsoft.com/office/word/2018/wordml" xmlns:w16du="http://schemas.microsoft.com/office/word/2023/wordml/word16du" xmlns:w16sdtdh="http://schemas.microsoft.com/office/word/2020/wordml/sdtdatahash" xmlns:w16se="http://schemas.microsoft.com/office/word/2015/wordml/symex" xmlns:wpg="http://schemas.microsoft.com/office/word/2010/wordprocessingGroup" xmlns:wpi="http://schemas.microsoft.com/office/word/2010/wordprocessingInk" xmlns:wne="http://schemas.microsoft.com/office/word/2006/wordml" xmlns:wps="http://schemas.microsoft.com/office/word/2010/wordprocessingShape" mc:Ignorable="w14 w15 w16se w16cid w16 w16cex w16sdtdh wp14">
   <w:p>
     <w:pPr>
       <w:pStyle w:val="Header"/>
@@ -2557,7 +2657,7 @@
 </file>
 
 <file path=word/header2.xml><?xml version="1.0" encoding="utf-8"?>
-<w:hdr xmlns:wpc="http://schemas.microsoft.com/office/word/2010/wordprocessingCanvas" xmlns:cx="http://schemas.microsoft.com/office/drawing/2014/chartex" xmlns:cx1="http://schemas.microsoft.com/office/drawing/2015/9/8/chartex" xmlns:cx2="http://schemas.microsoft.com/office/drawing/2015/10/21/chartex" xmlns:cx3="http://schemas.microsoft.com/office/drawing/2016/5/9/chartex" xmlns:cx4="http://schemas.microsoft.com/office/drawing/2016/5/10/chartex" xmlns:cx5="http://schemas.microsoft.com/office/drawing/2016/5/11/chartex" xmlns:cx6="http://schemas.microsoft.com/office/drawing/2016/5/12/chartex" xmlns:cx7="http://schemas.microsoft.com/office/drawing/2016/5/13/chartex" xmlns:cx8="http://schemas.microsoft.com/office/drawing/2016/5/14/chartex" xmlns:mc="http://schemas.openxmlformats.org/markup-compatibility/2006" xmlns:aink="http://schemas.microsoft.com/office/drawing/2016/ink" xmlns:am3d="http://schemas.microsoft.com/office/drawing/2017/model3d" xmlns:o="urn:schemas-microsoft-com:office:office" xmlns:oel="http://schemas.microsoft.com/office/2019/extlst" xmlns:r="http://schemas.openxmlformats.org/officeDocument/2006/relationships" xmlns:m="http://schemas.openxmlformats.org/officeDocument/2006/math" xmlns:v="urn:schemas-microsoft-com:vml" xmlns:wp14="http://schemas.microsoft.com/office/word/2010/wordprocessingDrawing" xmlns:wp="http://schemas.openxmlformats.org/drawingml/2006/wordprocessingDrawing" xmlns:w10="urn:schemas-microsoft-com:office:word" xmlns:w="http://schemas.openxmlformats.org/wordprocessingml/2006/main" xmlns:w14="http://schemas.microsoft.com/office/word/2010/wordml" xmlns:w15="http://schemas.microsoft.com/office/word/2012/wordml" xmlns:w16cex="http://schemas.microsoft.com/office/word/2018/wordml/cex" xmlns:w16cid="http://schemas.microsoft.com/office/word/2016/wordml/cid" xmlns:w16="http://schemas.microsoft.com/office/word/2018/wordml" xmlns:w16sdtdh="http://schemas.microsoft.com/office/word/2020/wordml/sdtdatahash" xmlns:w16se="http://schemas.microsoft.com/office/word/2015/wordml/symex" xmlns:wpg="http://schemas.microsoft.com/office/word/2010/wordprocessingGroup" xmlns:wpi="http://schemas.microsoft.com/office/word/2010/wordprocessingInk" xmlns:wne="http://schemas.microsoft.com/office/word/2006/wordml" xmlns:wps="http://schemas.microsoft.com/office/word/2010/wordprocessingShape" mc:Ignorable="w14 w15 w16se w16cid w16 w16cex w16sdtdh wp14">
+<w:hdr xmlns:wpc="http://schemas.microsoft.com/office/word/2010/wordprocessingCanvas" xmlns:cx="http://schemas.microsoft.com/office/drawing/2014/chartex" xmlns:cx1="http://schemas.microsoft.com/office/drawing/2015/9/8/chartex" xmlns:cx2="http://schemas.microsoft.com/office/drawing/2015/10/21/chartex" xmlns:cx3="http://schemas.microsoft.com/office/drawing/2016/5/9/chartex" xmlns:cx4="http://schemas.microsoft.com/office/drawing/2016/5/10/chartex" xmlns:cx5="http://schemas.microsoft.com/office/drawing/2016/5/11/chartex" xmlns:cx6="http://schemas.microsoft.com/office/drawing/2016/5/12/chartex" xmlns:cx7="http://schemas.microsoft.com/office/drawing/2016/5/13/chartex" xmlns:cx8="http://schemas.microsoft.com/office/drawing/2016/5/14/chartex" xmlns:mc="http://schemas.openxmlformats.org/markup-compatibility/2006" xmlns:aink="http://schemas.microsoft.com/office/drawing/2016/ink" xmlns:am3d="http://schemas.microsoft.com/office/drawing/2017/model3d" xmlns:o="urn:schemas-microsoft-com:office:office" xmlns:oel="http://schemas.microsoft.com/office/2019/extlst" xmlns:r="http://schemas.openxmlformats.org/officeDocument/2006/relationships" xmlns:m="http://schemas.openxmlformats.org/officeDocument/2006/math" xmlns:v="urn:schemas-microsoft-com:vml" xmlns:wp14="http://schemas.microsoft.com/office/word/2010/wordprocessingDrawing" xmlns:wp="http://schemas.openxmlformats.org/drawingml/2006/wordprocessingDrawing" xmlns:w10="urn:schemas-microsoft-com:office:word" xmlns:w="http://schemas.openxmlformats.org/wordprocessingml/2006/main" xmlns:w14="http://schemas.microsoft.com/office/word/2010/wordml" xmlns:w15="http://schemas.microsoft.com/office/word/2012/wordml" xmlns:w16cex="http://schemas.microsoft.com/office/word/2018/wordml/cex" xmlns:w16cid="http://schemas.microsoft.com/office/word/2016/wordml/cid" xmlns:w16="http://schemas.microsoft.com/office/word/2018/wordml" xmlns:w16du="http://schemas.microsoft.com/office/word/2023/wordml/word16du" xmlns:w16sdtdh="http://schemas.microsoft.com/office/word/2020/wordml/sdtdatahash" xmlns:w16se="http://schemas.microsoft.com/office/word/2015/wordml/symex" xmlns:wpg="http://schemas.microsoft.com/office/word/2010/wordprocessingGroup" xmlns:wpi="http://schemas.microsoft.com/office/word/2010/wordprocessingInk" xmlns:wne="http://schemas.microsoft.com/office/word/2006/wordml" xmlns:wps="http://schemas.microsoft.com/office/word/2010/wordprocessingShape" mc:Ignorable="w14 w15 w16se w16cid w16 w16cex w16sdtdh wp14">
   <w:p>
     <w:pPr>
       <w:pStyle w:val="Header"/>
@@ -3249,7 +3349,7 @@
 </file>
 
 <file path=word/header3.xml><?xml version="1.0" encoding="utf-8"?>
-<w:hdr xmlns:wpc="http://schemas.microsoft.com/office/word/2010/wordprocessingCanvas" xmlns:cx="http://schemas.microsoft.com/office/drawing/2014/chartex" xmlns:cx1="http://schemas.microsoft.com/office/drawing/2015/9/8/chartex" xmlns:cx2="http://schemas.microsoft.com/office/drawing/2015/10/21/chartex" xmlns:cx3="http://schemas.microsoft.com/office/drawing/2016/5/9/chartex" xmlns:cx4="http://schemas.microsoft.com/office/drawing/2016/5/10/chartex" xmlns:cx5="http://schemas.microsoft.com/office/drawing/2016/5/11/chartex" xmlns:cx6="http://schemas.microsoft.com/office/drawing/2016/5/12/chartex" xmlns:cx7="http://schemas.microsoft.com/office/drawing/2016/5/13/chartex" xmlns:cx8="http://schemas.microsoft.com/office/drawing/2016/5/14/chartex" xmlns:mc="http://schemas.openxmlformats.org/markup-compatibility/2006" xmlns:aink="http://schemas.microsoft.com/office/drawing/2016/ink" xmlns:am3d="http://schemas.microsoft.com/office/drawing/2017/model3d" xmlns:o="urn:schemas-microsoft-com:office:office" xmlns:oel="http://schemas.microsoft.com/office/2019/extlst" xmlns:r="http://schemas.openxmlformats.org/officeDocument/2006/relationships" xmlns:m="http://schemas.openxmlformats.org/officeDocument/2006/math" xmlns:v="urn:schemas-microsoft-com:vml" xmlns:wp14="http://schemas.microsoft.com/office/word/2010/wordprocessingDrawing" xmlns:wp="http://schemas.openxmlformats.org/drawingml/2006/wordprocessingDrawing" xmlns:w10="urn:schemas-microsoft-com:office:word" xmlns:w="http://schemas.openxmlformats.org/wordprocessingml/2006/main" xmlns:w14="http://schemas.microsoft.com/office/word/2010/wordml" xmlns:w15="http://schemas.microsoft.com/office/word/2012/wordml" xmlns:w16cex="http://schemas.microsoft.com/office/word/2018/wordml/cex" xmlns:w16cid="http://schemas.microsoft.com/office/word/2016/wordml/cid" xmlns:w16="http://schemas.microsoft.com/office/word/2018/wordml" xmlns:w16sdtdh="http://schemas.microsoft.com/office/word/2020/wordml/sdtdatahash" xmlns:w16se="http://schemas.microsoft.com/office/word/2015/wordml/symex" xmlns:wpg="http://schemas.microsoft.com/office/word/2010/wordprocessingGroup" xmlns:wpi="http://schemas.microsoft.com/office/word/2010/wordprocessingInk" xmlns:wne="http://schemas.microsoft.com/office/word/2006/wordml" xmlns:wps="http://schemas.microsoft.com/office/word/2010/wordprocessingShape" mc:Ignorable="w14 w15 w16se w16cid w16 w16cex w16sdtdh wp14">
+<w:hdr xmlns:wpc="http://schemas.microsoft.com/office/word/2010/wordprocessingCanvas" xmlns:cx="http://schemas.microsoft.com/office/drawing/2014/chartex" xmlns:cx1="http://schemas.microsoft.com/office/drawing/2015/9/8/chartex" xmlns:cx2="http://schemas.microsoft.com/office/drawing/2015/10/21/chartex" xmlns:cx3="http://schemas.microsoft.com/office/drawing/2016/5/9/chartex" xmlns:cx4="http://schemas.microsoft.com/office/drawing/2016/5/10/chartex" xmlns:cx5="http://schemas.microsoft.com/office/drawing/2016/5/11/chartex" xmlns:cx6="http://schemas.microsoft.com/office/drawing/2016/5/12/chartex" xmlns:cx7="http://schemas.microsoft.com/office/drawing/2016/5/13/chartex" xmlns:cx8="http://schemas.microsoft.com/office/drawing/2016/5/14/chartex" xmlns:mc="http://schemas.openxmlformats.org/markup-compatibility/2006" xmlns:aink="http://schemas.microsoft.com/office/drawing/2016/ink" xmlns:am3d="http://schemas.microsoft.com/office/drawing/2017/model3d" xmlns:o="urn:schemas-microsoft-com:office:office" xmlns:oel="http://schemas.microsoft.com/office/2019/extlst" xmlns:r="http://schemas.openxmlformats.org/officeDocument/2006/relationships" xmlns:m="http://schemas.openxmlformats.org/officeDocument/2006/math" xmlns:v="urn:schemas-microsoft-com:vml" xmlns:wp14="http://schemas.microsoft.com/office/word/2010/wordprocessingDrawing" xmlns:wp="http://schemas.openxmlformats.org/drawingml/2006/wordprocessingDrawing" xmlns:w10="urn:schemas-microsoft-com:office:word" xmlns:w="http://schemas.openxmlformats.org/wordprocessingml/2006/main" xmlns:w14="http://schemas.microsoft.com/office/word/2010/wordml" xmlns:w15="http://schemas.microsoft.com/office/word/2012/wordml" xmlns:w16cex="http://schemas.microsoft.com/office/word/2018/wordml/cex" xmlns:w16cid="http://schemas.microsoft.com/office/word/2016/wordml/cid" xmlns:w16="http://schemas.microsoft.com/office/word/2018/wordml" xmlns:w16du="http://schemas.microsoft.com/office/word/2023/wordml/word16du" xmlns:w16sdtdh="http://schemas.microsoft.com/office/word/2020/wordml/sdtdatahash" xmlns:w16se="http://schemas.microsoft.com/office/word/2015/wordml/symex" xmlns:wpg="http://schemas.microsoft.com/office/word/2010/wordprocessingGroup" xmlns:wpi="http://schemas.microsoft.com/office/word/2010/wordprocessingInk" xmlns:wne="http://schemas.microsoft.com/office/word/2006/wordml" xmlns:wps="http://schemas.microsoft.com/office/word/2010/wordprocessingShape" mc:Ignorable="w14 w15 w16se w16cid w16 w16cex w16sdtdh wp14">
   <w:p>
     <w:pPr>
       <w:pStyle w:val="Header"/>
@@ -3259,7 +3359,7 @@
 </file>
 
 <file path=word/numbering.xml><?xml version="1.0" encoding="utf-8"?>
-<w:numbering xmlns:wpc="http://schemas.microsoft.com/office/word/2010/wordprocessingCanvas" xmlns:cx="http://schemas.microsoft.com/office/drawing/2014/chartex" xmlns:cx1="http://schemas.microsoft.com/office/drawing/2015/9/8/chartex" xmlns:cx2="http://schemas.microsoft.com/office/drawing/2015/10/21/chartex" xmlns:cx3="http://schemas.microsoft.com/office/drawing/2016/5/9/chartex" xmlns:cx4="http://schemas.microsoft.com/office/drawing/2016/5/10/chartex" xmlns:cx5="http://schemas.microsoft.com/office/drawing/2016/5/11/chartex" xmlns:cx6="http://schemas.microsoft.com/office/drawing/2016/5/12/chartex" xmlns:cx7="http://schemas.microsoft.com/office/drawing/2016/5/13/chartex" xmlns:cx8="http://schemas.microsoft.com/office/drawing/2016/5/14/chartex" xmlns:mc="http://schemas.openxmlformats.org/markup-compatibility/2006" xmlns:aink="http://schemas.microsoft.com/office/drawing/2016/ink" xmlns:am3d="http://schemas.microsoft.com/office/drawing/2017/model3d" xmlns:o="urn:schemas-microsoft-com:office:office" xmlns:oel="http://schemas.microsoft.com/office/2019/extlst" xmlns:r="http://schemas.openxmlformats.org/officeDocument/2006/relationships" xmlns:m="http://schemas.openxmlformats.org/officeDocument/2006/math" xmlns:v="urn:schemas-microsoft-com:vml" xmlns:wp14="http://schemas.microsoft.com/office/word/2010/wordprocessingDrawing" xmlns:wp="http://schemas.openxmlformats.org/drawingml/2006/wordprocessingDrawing" xmlns:w10="urn:schemas-microsoft-com:office:word" xmlns:w="http://schemas.openxmlformats.org/wordprocessingml/2006/main" xmlns:w14="http://schemas.microsoft.com/office/word/2010/wordml" xmlns:w15="http://schemas.microsoft.com/office/word/2012/wordml" xmlns:w16cex="http://schemas.microsoft.com/office/word/2018/wordml/cex" xmlns:w16cid="http://schemas.microsoft.com/office/word/2016/wordml/cid" xmlns:w16="http://schemas.microsoft.com/office/word/2018/wordml" xmlns:w16sdtdh="http://schemas.microsoft.com/office/word/2020/wordml/sdtdatahash" xmlns:w16se="http://schemas.microsoft.com/office/word/2015/wordml/symex" xmlns:wpg="http://schemas.microsoft.com/office/word/2010/wordprocessingGroup" xmlns:wpi="http://schemas.microsoft.com/office/word/2010/wordprocessingInk" xmlns:wne="http://schemas.microsoft.com/office/word/2006/wordml" xmlns:wps="http://schemas.microsoft.com/office/word/2010/wordprocessingShape" mc:Ignorable="w14 w15 w16se w16cid w16 w16cex w16sdtdh wp14">
+<w:numbering xmlns:wpc="http://schemas.microsoft.com/office/word/2010/wordprocessingCanvas" xmlns:cx="http://schemas.microsoft.com/office/drawing/2014/chartex" xmlns:cx1="http://schemas.microsoft.com/office/drawing/2015/9/8/chartex" xmlns:cx2="http://schemas.microsoft.com/office/drawing/2015/10/21/chartex" xmlns:cx3="http://schemas.microsoft.com/office/drawing/2016/5/9/chartex" xmlns:cx4="http://schemas.microsoft.com/office/drawing/2016/5/10/chartex" xmlns:cx5="http://schemas.microsoft.com/office/drawing/2016/5/11/chartex" xmlns:cx6="http://schemas.microsoft.com/office/drawing/2016/5/12/chartex" xmlns:cx7="http://schemas.microsoft.com/office/drawing/2016/5/13/chartex" xmlns:cx8="http://schemas.microsoft.com/office/drawing/2016/5/14/chartex" xmlns:mc="http://schemas.openxmlformats.org/markup-compatibility/2006" xmlns:aink="http://schemas.microsoft.com/office/drawing/2016/ink" xmlns:am3d="http://schemas.microsoft.com/office/drawing/2017/model3d" xmlns:o="urn:schemas-microsoft-com:office:office" xmlns:oel="http://schemas.microsoft.com/office/2019/extlst" xmlns:r="http://schemas.openxmlformats.org/officeDocument/2006/relationships" xmlns:m="http://schemas.openxmlformats.org/officeDocument/2006/math" xmlns:v="urn:schemas-microsoft-com:vml" xmlns:wp14="http://schemas.microsoft.com/office/word/2010/wordprocessingDrawing" xmlns:wp="http://schemas.openxmlformats.org/drawingml/2006/wordprocessingDrawing" xmlns:w10="urn:schemas-microsoft-com:office:word" xmlns:w="http://schemas.openxmlformats.org/wordprocessingml/2006/main" xmlns:w14="http://schemas.microsoft.com/office/word/2010/wordml" xmlns:w15="http://schemas.microsoft.com/office/word/2012/wordml" xmlns:w16cex="http://schemas.microsoft.com/office/word/2018/wordml/cex" xmlns:w16cid="http://schemas.microsoft.com/office/word/2016/wordml/cid" xmlns:w16="http://schemas.microsoft.com/office/word/2018/wordml" xmlns:w16du="http://schemas.microsoft.com/office/word/2023/wordml/word16du" xmlns:w16sdtdh="http://schemas.microsoft.com/office/word/2020/wordml/sdtdatahash" xmlns:w16se="http://schemas.microsoft.com/office/word/2015/wordml/symex" xmlns:wpg="http://schemas.microsoft.com/office/word/2010/wordprocessingGroup" xmlns:wpi="http://schemas.microsoft.com/office/word/2010/wordprocessingInk" xmlns:wne="http://schemas.microsoft.com/office/word/2006/wordml" xmlns:wps="http://schemas.microsoft.com/office/word/2010/wordprocessingShape" mc:Ignorable="w14 w15 w16se w16cid w16 w16cex w16sdtdh wp14">
   <w:abstractNum w:abstractNumId="0" w15:restartNumberingAfterBreak="0">
     <w:nsid w:val="19365752"/>
     <w:multiLevelType w:val="hybridMultilevel"/>

</xml_diff>